<commit_message>
Prêmio da rifa (tablet), análise de custo-benefício e carga horária como pendente
- Regulamento e metodologia passam a deduzir o custo do prêmio antes da compra dos itens
- entregas/rifa/custo-beneficio.md com ponto de equilíbrio e cenários de venda

Co-Authored-By: Claude Opus 5.5 <noreply@anthropic.com>
Claude-Session: https://claude.ai/code/session_01MBn9YrntdXfTASAVKo9hpN
</commit_message>
<xml_diff>
--- a/entregas/anexo-1-regulamento-arrecadacao-rifa.docx
+++ b/entregas/anexo-1-regulamento-arrecadacao-rifa.docx
@@ -222,7 +222,7 @@
           <w:b w:val="0"/>
           <w:i w:val="0"/>
         </w:rPr>
-        <w:t>Prêmio: [PENDENTE: prêmio].</w:t>
+        <w:t>Prêmio: 01 (um) tablet, modelo [PENDENTE: modelo], novo e com nota fiscal.</w:t>
       </w:r>
     </w:p>
     <w:p>
@@ -283,7 +283,7 @@
           <w:b w:val="0"/>
           <w:i w:val="0"/>
         </w:rPr>
-        <w:t>Os valores arrecadados com a rifa serão utilizados exclusivamente na compra dos itens listados no item 2, mediante nota fiscal. A comissão financeira, composta por [PENDENTE: integrantes da comissão financeira], manterá o controle de entradas e saídas. Ao final, será apresentado relatório de transparência à professora responsável e à turma, com o valor arrecadado, os comprovantes de compra e o quantitativo entregue por unidade.</w:t>
+        <w:t>Os valores arrecadados com a rifa, deduzido o custo de aquisição do prêmio, serão utilizados exclusivamente na compra dos itens listados no item 2, mediante nota fiscal. A comissão financeira, composta por [PENDENTE: integrantes da comissão financeira], manterá o controle de entradas e saídas. Ao final, será apresentado relatório de transparência à professora responsável e à turma, com o valor arrecadado, os comprovantes de compra e o quantitativo entregue por unidade.</w:t>
       </w:r>
     </w:p>
     <w:p>

</xml_diff>

<commit_message>
Aplica orientações dos áudios: encontros às segundas, ações com a sociedade, QR Code na rifa e pré-projeto como anexo
Co-Authored-By: Claude Opus 5.5 <noreply@anthropic.com>
Claude-Session: https://claude.ai/code/session_01MBn9YrntdXfTASAVKo9hpN
</commit_message>
<xml_diff>
--- a/entregas/anexo-1-regulamento-arrecadacao-rifa.docx
+++ b/entregas/anexo-1-regulamento-arrecadacao-rifa.docx
@@ -150,7 +150,7 @@
           <w:b w:val="0"/>
           <w:i w:val="0"/>
         </w:rPr>
-        <w:t>As doações serão recebidas nas caixas de coleta identificadas do projeto, instaladas em locais autorizados pela instituição. A equipe de Logística e Arrecadação fará o recolhimento e a triagem semanal, com registro em planilha de controle.</w:t>
+        <w:t>As doações serão recebidas nas caixas de coleta identificadas do projeto, instaladas no campus em locais autorizados pela instituição e em instituições parceiras da comunidade (igrejas, delegacias e estabelecimentos comerciais), mediante autorização do responsável por cada local. A equipe de Logística e Arrecadação fará o recolhimento e a triagem semanal, com registro em planilha de controle.</w:t>
       </w:r>
     </w:p>
     <w:p>
@@ -187,6 +187,18 @@
           <w:i w:val="0"/>
         </w:rPr>
         <w:t>Cada acadêmico participante recebe um bloco de 30 bilhetes em sequência, registrado em planilha de distribuição.</w:t>
+      </w:r>
+    </w:p>
+    <w:p>
+      <w:pPr>
+        <w:pStyle w:val="ListBullet"/>
+      </w:pPr>
+      <w:r>
+        <w:rPr>
+          <w:b w:val="0"/>
+          <w:i w:val="0"/>
+        </w:rPr>
+        <w:t>Cada bilhete traz o perfil do projeto no Instagram ([PENDENTE: @ do Instagram do projeto]) e um QR Code de acesso a ele, para que o comprador conheça o projeto.</w:t>
       </w:r>
     </w:p>
     <w:p>

</xml_diff>

<commit_message>
Inclui imagens do pré-projeto: logos no cabeçalho e figuras de identidade visual
- assets/: logo UniCesumar, selo, figuras 01-03 (comprimidas)
- novo campo 'Identidade visual e materiais' na dimensão pedagógica
- check.sh junta linhas de PDF por frase (evita falso positivo em 'nota fiscal')

Co-Authored-By: Claude Opus 5.5 <noreply@anthropic.com>
Claude-Session: https://claude.ai/code/session_01MBn9YrntdXfTASAVKo9hpN
</commit_message>
<xml_diff>
--- a/entregas/anexo-1-regulamento-arrecadacao-rifa.docx
+++ b/entregas/anexo-1-regulamento-arrecadacao-rifa.docx
@@ -2,9 +2,109 @@
 <file path=word/document.xml><?xml version="1.0" encoding="utf-8"?>
 <w:document xmlns:wpc="http://schemas.microsoft.com/office/word/2010/wordprocessingCanvas" xmlns:mo="http://schemas.microsoft.com/office/mac/office/2008/main" xmlns:mc="http://schemas.openxmlformats.org/markup-compatibility/2006" xmlns:mv="urn:schemas-microsoft-com:mac:vml" xmlns:o="urn:schemas-microsoft-com:office:office" xmlns:r="http://schemas.openxmlformats.org/officeDocument/2006/relationships" xmlns:m="http://schemas.openxmlformats.org/officeDocument/2006/math" xmlns:v="urn:schemas-microsoft-com:vml" xmlns:wp14="http://schemas.microsoft.com/office/word/2010/wordprocessingDrawing" xmlns:wp="http://schemas.openxmlformats.org/drawingml/2006/wordprocessingDrawing" xmlns:w10="urn:schemas-microsoft-com:office:word" xmlns:w="http://schemas.openxmlformats.org/wordprocessingml/2006/main" xmlns:w14="http://schemas.microsoft.com/office/word/2010/wordml" xmlns:wpg="http://schemas.microsoft.com/office/word/2010/wordprocessingGroup" xmlns:wpi="http://schemas.microsoft.com/office/word/2010/wordprocessingInk" xmlns:wne="http://schemas.microsoft.com/office/word/2006/wordml" xmlns:wps="http://schemas.microsoft.com/office/word/2010/wordprocessingShape" mc:Ignorable="w14 wp14">
   <w:body>
+    <w:tbl>
+      <w:tblPr>
+        <w:tblW w:type="auto" w:w="0"/>
+        <w:tblLayout w:type="fixed"/>
+        <w:tblLook w:firstColumn="1" w:firstRow="1" w:lastColumn="0" w:lastRow="0" w:noHBand="0" w:noVBand="1" w:val="04A0"/>
+        <w:tblLayout w:type="fixed"/>
+      </w:tblPr>
+      <w:tblGrid>
+        <w:gridCol w:w="5103"/>
+        <w:gridCol w:w="5103"/>
+      </w:tblGrid>
+      <w:tr>
+        <w:tc>
+          <w:tcPr>
+            <w:tcW w:type="dxa" w:w="5102"/>
+            <w:vAlign w:val="center"/>
+          </w:tcPr>
+          <w:p>
+            <w:r>
+              <w:drawing>
+                <wp:inline xmlns:a="http://schemas.openxmlformats.org/drawingml/2006/main" xmlns:pic="http://schemas.openxmlformats.org/drawingml/2006/picture">
+                  <wp:extent cx="2117971" cy="377999"/>
+                  <wp:docPr id="1" name="Picture 1"/>
+                  <wp:cNvGraphicFramePr>
+                    <a:graphicFrameLocks noChangeAspect="1"/>
+                  </wp:cNvGraphicFramePr>
+                  <a:graphic>
+                    <a:graphicData uri="http://schemas.openxmlformats.org/drawingml/2006/picture">
+                      <pic:pic>
+                        <pic:nvPicPr>
+                          <pic:cNvPr id="0" name="logo-unicesumar.png"/>
+                          <pic:cNvPicPr/>
+                        </pic:nvPicPr>
+                        <pic:blipFill>
+                          <a:blip r:embed="rId9"/>
+                          <a:stretch>
+                            <a:fillRect/>
+                          </a:stretch>
+                        </pic:blipFill>
+                        <pic:spPr>
+                          <a:xfrm>
+                            <a:off x="0" y="0"/>
+                            <a:ext cx="2117971" cy="377999"/>
+                          </a:xfrm>
+                          <a:prstGeom prst="rect"/>
+                        </pic:spPr>
+                      </pic:pic>
+                    </a:graphicData>
+                  </a:graphic>
+                </wp:inline>
+              </w:drawing>
+            </w:r>
+          </w:p>
+        </w:tc>
+        <w:tc>
+          <w:tcPr>
+            <w:tcW w:type="dxa" w:w="5102"/>
+          </w:tcPr>
+          <w:p>
+            <w:pPr>
+              <w:jc w:val="right"/>
+            </w:pPr>
+            <w:r>
+              <w:drawing>
+                <wp:inline xmlns:a="http://schemas.openxmlformats.org/drawingml/2006/main" xmlns:pic="http://schemas.openxmlformats.org/drawingml/2006/picture">
+                  <wp:extent cx="705599" cy="705599"/>
+                  <wp:docPr id="2" name="Picture 2"/>
+                  <wp:cNvGraphicFramePr>
+                    <a:graphicFrameLocks noChangeAspect="1"/>
+                  </wp:cNvGraphicFramePr>
+                  <a:graphic>
+                    <a:graphicData uri="http://schemas.openxmlformats.org/drawingml/2006/picture">
+                      <pic:pic>
+                        <pic:nvPicPr>
+                          <pic:cNvPr id="0" name="selo-efeito-rebote.jpg"/>
+                          <pic:cNvPicPr/>
+                        </pic:nvPicPr>
+                        <pic:blipFill>
+                          <a:blip r:embed="rId10"/>
+                          <a:stretch>
+                            <a:fillRect/>
+                          </a:stretch>
+                        </pic:blipFill>
+                        <pic:spPr>
+                          <a:xfrm>
+                            <a:off x="0" y="0"/>
+                            <a:ext cx="705599" cy="705599"/>
+                          </a:xfrm>
+                          <a:prstGeom prst="rect"/>
+                        </pic:spPr>
+                      </pic:pic>
+                    </a:graphicData>
+                  </a:graphic>
+                </wp:inline>
+              </w:drawing>
+            </w:r>
+          </w:p>
+        </w:tc>
+      </w:tr>
+    </w:tbl>
     <w:p>
       <w:pPr>
-        <w:spacing w:after="200"/>
+        <w:spacing w:before="160" w:after="200"/>
         <w:jc w:val="center"/>
       </w:pPr>
       <w:r>

</xml_diff>

<commit_message>
Instagram, instituição parceira, tablet Galaxy Tab A11 e sorteio em 02/11
- custo-beneficio.md com preços pesquisados (out/2026)

Co-Authored-By: Claude Opus 5.5 <noreply@anthropic.com>
Claude-Session: https://claude.ai/code/session_01MBn9YrntdXfTASAVKo9hpN
</commit_message>
<xml_diff>
--- a/entregas/anexo-1-regulamento-arrecadacao-rifa.docx
+++ b/entregas/anexo-1-regulamento-arrecadacao-rifa.docx
@@ -250,7 +250,7 @@
           <w:b w:val="0"/>
           <w:i w:val="0"/>
         </w:rPr>
-        <w:t>As doações serão recebidas nas caixas de coleta identificadas do projeto, instaladas no campus em locais autorizados pela instituição e em instituições parceiras da comunidade (igrejas, delegacias e estabelecimentos comerciais), mediante autorização do responsável por cada local. A equipe de Logística e Arrecadação fará o recolhimento e a triagem semanal, com registro em planilha de controle.</w:t>
+        <w:t>As doações serão recebidas nas caixas de coleta identificadas do projeto, instaladas no campus da UniCesumar, instituição parceira, em locais autorizados, e, mediante aprovação da professora responsável, em outras instituições da comunidade (igrejas, delegacias e estabelecimentos comerciais), com autorização do responsável por cada local. A equipe de Logística e Arrecadação fará o recolhimento e a triagem semanal, com registro em planilha de controle.</w:t>
       </w:r>
     </w:p>
     <w:p>
@@ -298,7 +298,7 @@
           <w:b w:val="0"/>
           <w:i w:val="0"/>
         </w:rPr>
-        <w:t>Cada bilhete traz o perfil do projeto no Instagram ([PENDENTE: @ do Instagram do projeto]) e um QR Code de acesso a ele, para que o comprador conheça o projeto.</w:t>
+        <w:t>Cada bilhete traz o perfil do projeto no Instagram (@efeitorebote.oficial) e um QR Code de acesso a ele, para que o comprador conheça o projeto.</w:t>
       </w:r>
     </w:p>
     <w:p>
@@ -334,7 +334,7 @@
           <w:b w:val="0"/>
           <w:i w:val="0"/>
         </w:rPr>
-        <w:t>Prêmio: 01 (um) tablet, modelo [PENDENTE: modelo], novo e com nota fiscal.</w:t>
+        <w:t>Prêmio: 01 (um) tablet Samsung Galaxy Tab A11 (64 GB, Wi-Fi) ou modelo equivalente, novo e com nota fiscal.</w:t>
       </w:r>
     </w:p>
     <w:p>
@@ -346,7 +346,7 @@
           <w:b w:val="0"/>
           <w:i w:val="0"/>
         </w:rPr>
-        <w:t>Sorteio: público e registrado em vídeo, em [PENDENTE: data, horário e local], pelo método [PENDENTE: método do sorteio]. Concorrem apenas os bilhetes pagos e registrados.</w:t>
+        <w:t>Sorteio: público e registrado em vídeo, em 02/11/2026, [PENDENTE: horário e local], pelo método [PENDENTE: método do sorteio]. Concorrem apenas os bilhetes pagos e registrados.</w:t>
       </w:r>
     </w:p>
     <w:p>

</xml_diff>

<commit_message>
Rifa: Galaxy Tab A11+, venda descentralizada com registro digital e sorteio ao vivo em 02/11
- regulamento com prazos (vendas até 30/10, lista em 01/11, retirada em 30 dias)
- cronograma: encontros 9 e 13 alinhados ao sorteio em 02/11

Co-Authored-By: Claude Opus 5.5 <noreply@anthropic.com>
Claude-Session: https://claude.ai/code/session_01MBn9YrntdXfTASAVKo9hpN
</commit_message>
<xml_diff>
--- a/entregas/anexo-1-regulamento-arrecadacao-rifa.docx
+++ b/entregas/anexo-1-regulamento-arrecadacao-rifa.docx
@@ -310,7 +310,7 @@
           <w:b w:val="0"/>
           <w:i w:val="0"/>
         </w:rPr>
-        <w:t>Cada venda deve ser registrada no canhoto, com nome e telefone do comprador e a confirmação de pagamento.</w:t>
+        <w:t>Cada acadêmico vende seus bilhetes de forma independente. A cada venda, preenche o canhoto (nome e telefone do comprador) e registra no mesmo dia, no formulário on-line oficial da rifa, o número do bilhete, os dados do comprador e a forma de pagamento. O formulário é o registro oficial para o sorteio.</w:t>
       </w:r>
     </w:p>
     <w:p>
@@ -322,7 +322,7 @@
           <w:b w:val="0"/>
           <w:i w:val="0"/>
         </w:rPr>
-        <w:t>Os valores e os canhotos são entregues à comissão financeira em acertos periódicos; os bilhetes não vendidos devem ser devolvidos até [PENDENTE: data-limite de devolução].</w:t>
+        <w:t>O pagamento é feito preferencialmente por PIX diretamente na conta da comissão financeira ([PENDENTE: chave PIX da comissão]), com o número do bilhete na descrição. Valores em espécie são entregues à comissão nos acertos semanais, às segundas-feiras, nos encontros do projeto.</w:t>
       </w:r>
     </w:p>
     <w:p>
@@ -334,7 +334,7 @@
           <w:b w:val="0"/>
           <w:i w:val="0"/>
         </w:rPr>
-        <w:t>Prêmio: 01 (um) tablet Samsung Galaxy Tab A11 (64 GB, Wi-Fi) ou modelo equivalente, novo e com nota fiscal.</w:t>
+        <w:t>Prazo final de venda, registro e pagamento: 30/10/2026, às 23h59. Bilhetes não registrados ou não pagos até esse horário não concorrem.</w:t>
       </w:r>
     </w:p>
     <w:p>
@@ -346,7 +346,7 @@
           <w:b w:val="0"/>
           <w:i w:val="0"/>
         </w:rPr>
-        <w:t>Sorteio: público e registrado em vídeo, em 02/11/2026, [PENDENTE: horário e local], pelo método [PENDENTE: método do sorteio]. Concorrem apenas os bilhetes pagos e registrados.</w:t>
+        <w:t>Em 01/11/2026, a lista dos números participantes (sem dados pessoais) é publicada no @efeitorebote.oficial.</w:t>
       </w:r>
     </w:p>
     <w:p>
@@ -358,7 +358,43 @@
           <w:b w:val="0"/>
           <w:i w:val="0"/>
         </w:rPr>
-        <w:t>O resultado será divulgado nos canais do projeto e o ganhador será contatado pelo telefone informado no canhoto, tendo [PENDENTE: prazo] para retirar o prêmio.</w:t>
+        <w:t>Os canhotos e os bilhetes não vendidos são entregues à comissão financeira no primeiro encontro após o sorteio, para conferência e arquivo.</w:t>
+      </w:r>
+    </w:p>
+    <w:p>
+      <w:pPr>
+        <w:pStyle w:val="ListBullet"/>
+      </w:pPr>
+      <w:r>
+        <w:rPr>
+          <w:b w:val="0"/>
+          <w:i w:val="0"/>
+        </w:rPr>
+        <w:t>Prêmio: 01 (um) tablet Samsung Galaxy Tab A11+ (11 polegadas, Wi-Fi) ou modelo equivalente, novo e com nota fiscal.</w:t>
+      </w:r>
+    </w:p>
+    <w:p>
+      <w:pPr>
+        <w:pStyle w:val="ListBullet"/>
+      </w:pPr>
+      <w:r>
+        <w:rPr>
+          <w:b w:val="0"/>
+          <w:i w:val="0"/>
+        </w:rPr>
+        <w:t>Sorteio: 02/11/2026, às [PENDENTE: horário], com transmissão ao vivo no @efeitorebote.oficial. Os números da lista oficial são impressos, dobrados e depositados em urna; um número é retirado na presença da professora responsável e de duas testemunhas, com lavratura de ata e gravação do vídeo.</w:t>
+      </w:r>
+    </w:p>
+    <w:p>
+      <w:pPr>
+        <w:pStyle w:val="ListBullet"/>
+      </w:pPr>
+      <w:r>
+        <w:rPr>
+          <w:b w:val="0"/>
+          <w:i w:val="0"/>
+        </w:rPr>
+        <w:t>O resultado será divulgado nos canais do projeto e o ganhador será contatado pelo telefone informado no canhoto, em até 24 horas após o sorteio, tendo 30 dias para retirar o prêmio. Se o prêmio não for retirado nesse prazo, será realizado novo sorteio entre os demais números participantes, divulgado nos mesmos canais.</w:t>
       </w:r>
     </w:p>
     <w:p>

</xml_diff>

<commit_message>
Projeto escrito: ajustes em relação ao pré-projeto, sistema de vendas, conta exclusiva, LGPD e transparência
- validação da lista de itens com as unidades antes de qualquer compra (cronograma e metodologia)
- regulamento alinhado ao sistema on-line; aviso de uso de dados no bilhete
- cota de impressão declarada como pendência

Co-Authored-By: Claude Opus 5.5 <noreply@anthropic.com>
Claude-Session: https://claude.ai/code/session_01MBn9YrntdXfTASAVKo9hpN
</commit_message>
<xml_diff>
--- a/entregas/anexo-1-regulamento-arrecadacao-rifa.docx
+++ b/entregas/anexo-1-regulamento-arrecadacao-rifa.docx
@@ -310,7 +310,7 @@
           <w:b w:val="0"/>
           <w:i w:val="0"/>
         </w:rPr>
-        <w:t>Cada acadêmico vende seus bilhetes de forma independente. A cada venda, preenche o canhoto (nome e telefone do comprador) e registra no mesmo dia, no formulário on-line oficial da rifa, o número do bilhete, os dados do comprador e a forma de pagamento. O formulário é o registro oficial para o sorteio.</w:t>
+        <w:t>Cada acadêmico vende seus bilhetes de forma independente. A cada venda, preenche o canhoto (nome e telefone do comprador) e registra no mesmo dia, no sistema on-line de vendas do projeto, os números vendidos, os dados do comprador e a forma de pagamento. O sistema é o registro oficial para o sorteio: aceita apenas números do bloco do próprio acadêmico e impede venda duplicada.</w:t>
       </w:r>
     </w:p>
     <w:p>
@@ -322,7 +322,7 @@
           <w:b w:val="0"/>
           <w:i w:val="0"/>
         </w:rPr>
-        <w:t>O pagamento é feito preferencialmente por PIX diretamente na conta da comissão financeira ([PENDENTE: chave PIX da comissão]), com o número do bilhete na descrição. Valores em espécie são entregues à comissão nos acertos semanais, às segundas-feiras, nos encontros do projeto.</w:t>
+        <w:t>O pagamento é feito preferencialmente por PIX, pelo código gerado no sistema (valor exato e identificação do pedido), diretamente na conta de recebimento de uso exclusivo da rifa, indicada pela comissão financeira e aprovada pela professora responsável ([PENDENTE: chave PIX da comissão]). Valores em espécie são entregues à comissão nos acertos semanais, às segundas-feiras, nos encontros do projeto.</w:t>
       </w:r>
     </w:p>
     <w:p>
@@ -407,6 +407,18 @@
           <w:i w:val="0"/>
         </w:rPr>
         <w:t>A realização da rifa está condicionada à autorização da instituição, observadas as normas institucionais e a legislação aplicável.</w:t>
+      </w:r>
+    </w:p>
+    <w:p>
+      <w:pPr>
+        <w:pStyle w:val="ListBullet"/>
+      </w:pPr>
+      <w:r>
+        <w:rPr>
+          <w:b w:val="0"/>
+          <w:i w:val="0"/>
+        </w:rPr>
+        <w:t>Dados pessoais: nome e telefone do comprador servem apenas para identificar o bilhete e contatar o ganhador; não são divulgados e serão eliminados após a entrega do prêmio (Lei nº 13.709/2018).</w:t>
       </w:r>
     </w:p>
     <w:p>

</xml_diff>

<commit_message>
Revisor-final: novo agente; ajustes apontados (citações e referências ABNT, base legal da rifa, ações fora dos encontros, compra dos itens e prêmio, meta, linguagem)
Co-Authored-By: Claude Opus 5.5 <noreply@anthropic.com>
Claude-Session: https://claude.ai/code/session_01MBn9YrntdXfTASAVKo9hpN
</commit_message>
<xml_diff>
--- a/entregas/anexo-1-regulamento-arrecadacao-rifa.docx
+++ b/entregas/anexo-1-regulamento-arrecadacao-rifa.docx
@@ -406,7 +406,19 @@
           <w:b w:val="0"/>
           <w:i w:val="0"/>
         </w:rPr>
-        <w:t>A realização da rifa está condicionada à autorização da instituição, observadas as normas institucionais e a legislação aplicável.</w:t>
+        <w:t>A realização da rifa está condicionada à autorização da instituição e da professora responsável, observadas as normas institucionais e a legislação federal sobre distribuição de prêmios mediante sorteio (Decreto-Lei nº 6.259/1944 e Lei nº 5.768/1971). Sem essa autorização, a rifa não será iniciada.</w:t>
+      </w:r>
+    </w:p>
+    <w:p>
+      <w:pPr>
+        <w:pStyle w:val="ListBullet"/>
+      </w:pPr>
+      <w:r>
+        <w:rPr>
+          <w:b w:val="0"/>
+          <w:i w:val="0"/>
+        </w:rPr>
+        <w:t>Se o sorteio precisar ser adiado, a nova data será divulgada com antecedência nos canais do projeto. Se a rifa for cancelada, o valor pago será integralmente devolvido a cada comprador pela mesma forma de pagamento.</w:t>
       </w:r>
     </w:p>
     <w:p>

</xml_diff>